<commit_message>
docs(bitacora): precisar que el cable parecia bien conectado y como prevenir la vuelta del fallo
</commit_message>
<xml_diff>
--- a/docs/BITACORA_DOMINGO_2026-09-27.docx
+++ b/docs/BITACORA_DOMINGO_2026-09-27.docx
@@ -1369,7 +1369,7 @@
           <w:b w:val="0"/>
           <w:sz w:val="22"/>
         </w:rPr>
-        <w:t>La solución fue desconectar y volver a conectar el cable de datos del sensor. Desde</w:t>
+        <w:t>La solución fue desconectar y volver a conectar el cable de datos del sensor, con un</w:t>
       </w:r>
     </w:p>
     <w:p>
@@ -1378,7 +1378,106 @@
           <w:b w:val="0"/>
           <w:sz w:val="22"/>
         </w:rPr>
-        <w:t>las 22:54 el módulo publica las cinco variables en el mismo ciclo:</w:t>
+        <w:t>matiz que conviene dejar anotado: el cable parecía bien conectado. Se revisó primero y</w:t>
+      </w:r>
+    </w:p>
+    <w:p>
+      <w:r>
+        <w:rPr>
+          <w:b w:val="0"/>
+          <w:sz w:val="22"/>
+        </w:rPr>
+        <w:t>a simple vista estaba en su sitio; aun así no daba datos, y fue al sacarlo y volver a</w:t>
+      </w:r>
+    </w:p>
+    <w:p>
+      <w:r>
+        <w:rPr>
+          <w:b w:val="0"/>
+          <w:sz w:val="22"/>
+        </w:rPr>
+        <w:t>meterlo cuando empezó a responder. Es decir, no era un cable fuera de su pin, sino un</w:t>
+      </w:r>
+    </w:p>
+    <w:p>
+      <w:r>
+        <w:rPr>
+          <w:b w:val="0"/>
+          <w:sz w:val="22"/>
+        </w:rPr>
+        <w:t>contacto eléctrico deficiente con aspecto correcto: la punta entraba, pero no llegaba</w:t>
+      </w:r>
+    </w:p>
+    <w:p>
+      <w:r>
+        <w:rPr>
+          <w:b w:val="0"/>
+          <w:sz w:val="22"/>
+        </w:rPr>
+        <w:t>a tocar bien. Suele deberse al terminal hembra que se abre con el uso, a óxido o suciedad</w:t>
+      </w:r>
+    </w:p>
+    <w:p>
+      <w:r>
+        <w:rPr>
+          <w:b w:val="0"/>
+          <w:sz w:val="22"/>
+        </w:rPr>
+        <w:t>en el pin, o a un hilo roto por dentro del aislamiento.</w:t>
+      </w:r>
+    </w:p>
+    <w:p>
+      <w:r>
+        <w:rPr>
+          <w:b w:val="0"/>
+          <w:sz w:val="22"/>
+        </w:rPr>
+        <w:t>Ese tipo de avería vuelve sola: por eso conviene sustituir el cable por uno nuevo si el</w:t>
+      </w:r>
+    </w:p>
+    <w:p>
+      <w:r>
+        <w:rPr>
+          <w:b w:val="0"/>
+          <w:sz w:val="22"/>
+        </w:rPr>
+        <w:t>terminal está flojo, sujetarlo con una brida o cinta para que nadie lo mueva, y —cuando la</w:t>
+      </w:r>
+    </w:p>
+    <w:p>
+      <w:r>
+        <w:rPr>
+          <w:b w:val="0"/>
+          <w:sz w:val="22"/>
+        </w:rPr>
+        <w:t>maqueta quede armada— dejarla publicando un buen rato y comprobar que **ningún ciclo se</w:t>
+      </w:r>
+    </w:p>
+    <w:p>
+      <w:r>
+        <w:rPr>
+          <w:b w:val="0"/>
+          <w:sz w:val="22"/>
+        </w:rPr>
+        <w:t>queda sin las dos variables de ambiente**. Si aparece un hueco, el contacto volvió a</w:t>
+      </w:r>
+    </w:p>
+    <w:p>
+      <w:r>
+        <w:rPr>
+          <w:b w:val="0"/>
+          <w:sz w:val="22"/>
+        </w:rPr>
+        <w:t>fallar.</w:t>
+      </w:r>
+    </w:p>
+    <w:p>
+      <w:r>
+        <w:rPr>
+          <w:b w:val="0"/>
+          <w:sz w:val="22"/>
+        </w:rPr>
+        <w:t>Desde las 22:54 el módulo publica las cinco variables en el mismo ciclo:</w:t>
       </w:r>
     </w:p>
     <w:p>

</xml_diff>